<commit_message>
Add devcontainer configuration and enhance PDF generation with Pandoc support
</commit_message>
<xml_diff>
--- a/templates/A. AΠΟΦΑΣΗ ΚΑΝΟΝΙΚΗ ΜΟΝΙΜΩΝ.docx
+++ b/templates/A. AΠΟΦΑΣΗ ΚΑΝΟΝΙΚΗ ΜΟΝΙΜΩΝ.docx
@@ -527,31 +527,18 @@
                     </w:rPr>
                     <w:t xml:space="preserve">Email: </w:t>
                   </w:r>
-                  <w:r>
-                    <w:fldChar w:fldCharType="begin"/>
-                  </w:r>
-                  <w:r>
-                    <w:rPr>
-                      <w:lang w:val="en-US"/>
-                    </w:rPr>
-                    <w:instrText>HYPERLINK "mailto:mail@3lyk-argous.arg.sch.gr"</w:instrText>
-                  </w:r>
-                  <w:r>
-                    <w:fldChar w:fldCharType="separate"/>
-                  </w:r>
-                  <w:r>
-                    <w:rPr>
-                      <w:rStyle w:val="-"/>
-                      <w:rFonts w:ascii="Calibri" w:hAnsi="Calibri"/>
-                      <w:spacing w:val="-2"/>
-                      <w:szCs w:val="22"/>
-                      <w:lang w:val="en-US"/>
-                    </w:rPr>
-                    <w:t>mail@3lyk-argous.arg.sch.gr</w:t>
-                  </w:r>
-                  <w:r>
-                    <w:fldChar w:fldCharType="end"/>
-                  </w:r>
+                  <w:hyperlink r:id="rId7" w:history="1">
+                    <w:r>
+                      <w:rPr>
+                        <w:rStyle w:val="-"/>
+                        <w:rFonts w:ascii="Calibri" w:hAnsi="Calibri"/>
+                        <w:spacing w:val="-2"/>
+                        <w:szCs w:val="22"/>
+                        <w:lang w:val="en-US"/>
+                      </w:rPr>
+                      <w:t>mail@3lyk-argous.arg.sch.gr</w:t>
+                    </w:r>
+                  </w:hyperlink>
                 </w:p>
                 <w:p>
                   <w:pPr>
@@ -1522,6 +1509,23 @@
           <w:sz w:val="22"/>
           <w:szCs w:val="22"/>
         </w:rPr>
+        <w:t>_</w:t>
+      </w:r>
+      <w:r>
+        <w:rPr>
+          <w:rFonts w:asciiTheme="minorHAnsi" w:hAnsiTheme="minorHAnsi"/>
+          <w:sz w:val="22"/>
+          <w:szCs w:val="22"/>
+          <w:lang w:val="en-US"/>
+        </w:rPr>
+        <w:t>gen</w:t>
+      </w:r>
+      <w:r>
+        <w:rPr>
+          <w:rFonts w:asciiTheme="minorHAnsi" w:hAnsiTheme="minorHAnsi"/>
+          <w:sz w:val="22"/>
+          <w:szCs w:val="22"/>
+        </w:rPr>
         <w:t xml:space="preserve"> }}</w:t>
       </w:r>
       <w:r>
@@ -1550,6 +1554,23 @@
         <w:t>onoma</w:t>
       </w:r>
       <w:proofErr w:type="spellEnd"/>
+      <w:r>
+        <w:rPr>
+          <w:rFonts w:asciiTheme="minorHAnsi" w:hAnsiTheme="minorHAnsi"/>
+          <w:sz w:val="22"/>
+          <w:szCs w:val="22"/>
+        </w:rPr>
+        <w:t>_</w:t>
+      </w:r>
+      <w:r>
+        <w:rPr>
+          <w:rFonts w:asciiTheme="minorHAnsi" w:hAnsiTheme="minorHAnsi"/>
+          <w:sz w:val="22"/>
+          <w:szCs w:val="22"/>
+          <w:lang w:val="en-US"/>
+        </w:rPr>
+        <w:t>gen</w:t>
+      </w:r>
       <w:r>
         <w:rPr>
           <w:rFonts w:asciiTheme="minorHAnsi" w:hAnsiTheme="minorHAnsi"/>
@@ -4883,7 +4904,7 @@
 </file>
 
 <file path=customXml/itemProps1.xml><?xml version="1.0" encoding="utf-8"?>
-<ds:datastoreItem xmlns:ds="http://schemas.openxmlformats.org/officeDocument/2006/customXml" ds:itemID="{D052B4C0-93B3-4017-99BC-A912A821BF5A}">
+<ds:datastoreItem xmlns:ds="http://schemas.openxmlformats.org/officeDocument/2006/customXml" ds:itemID="{84B2EB41-9DBE-4D10-AA66-D1F94CC2659A}">
   <ds:schemaRefs>
     <ds:schemaRef ds:uri="http://schemas.openxmlformats.org/officeDocument/2006/bibliography"/>
   </ds:schemaRefs>

</xml_diff>